<commit_message>
chore(markdown-vault): 同步 vault 文档改动（CodeScope 使用产生）
</commit_message>
<xml_diff>
--- a/markdown-vault/office/我的Office/返修论文.docx
+++ b/markdown-vault/office/我的Office/返修论文.docx
@@ -6,8 +6,10 @@
       <w:pPr>
         <w:pStyle w:val="885"/>
         <w:pBdr/>
-        <w:spacing/>
-        <w:ind/>
+        <w:shd w:val="clear" w:color="ffffff" w:themeColor="background1" w:fill="ffffff" w:themeFill="background1"/>
+        <w:spacing/>
+        <w:ind/>
+        <w:jc w:val="center"/>
         <w:rPr>
           <w:rFonts w:ascii="WenQuanYi Zen Hei Mono" w:hAnsi="WenQuanYi Zen Hei Mono" w:cs="WenQuanYi Zen Hei Mono"/>
         </w:rPr>
@@ -20,6 +22,41 @@
       <w:r>
         <w:rPr>
           <w:rFonts w:ascii="WenQuanYi Zen Hei Mono" w:hAnsi="WenQuanYi Zen Hei Mono" w:eastAsia="WenQuanYi Zen Hei Mono" w:cs="WenQuanYi Zen Hei Mono"/>
+        </w:rPr>
+        <w:t xml:space="preserve">确实</w:t>
+      </w:r>
+      <w:r>
+        <w:rPr>
+          <w:rFonts w:ascii="WenQuanYi Zen Hei Mono" w:hAnsi="WenQuanYi Zen Hei Mono" w:eastAsia="WenQuanYi Zen Hei Mono" w:cs="WenQuanYi Zen Hei Mono"/>
+        </w:rPr>
+        <w:t xml:space="preserve">可以</w:t>
+      </w:r>
+      <w:r>
+        <w:rPr>
+          <w:rFonts w:ascii="WenQuanYi Zen Hei Mono" w:hAnsi="WenQuanYi Zen Hei Mono" w:eastAsia="WenQuanYi Zen Hei Mono" w:cs="WenQuanYi Zen Hei Mono"/>
+        </w:rPr>
+        <w:t xml:space="preserve">实现</w:t>
+      </w:r>
+      <w:r>
+        <w:rPr>
+          <w:rFonts w:ascii="WenQuanYi Zen Hei Mono" w:hAnsi="WenQuanYi Zen Hei Mono" w:eastAsia="WenQuanYi Zen Hei Mono" w:cs="WenQuanYi Zen Hei Mono"/>
+        </w:rPr>
+        <w:t xml:space="preserve">同步</w:t>
+      </w:r>
+      <w:r>
+        <w:rPr>
+          <w:rFonts w:ascii="WenQuanYi Zen Hei Mono" w:hAnsi="WenQuanYi Zen Hei Mono" w:eastAsia="WenQuanYi Zen Hei Mono" w:cs="WenQuanYi Zen Hei Mono"/>
+        </w:rPr>
+        <w:t xml:space="preserve">了吗</w:t>
+      </w:r>
+      <w:r>
+        <w:rPr>
+          <w:rFonts w:ascii="WenQuanYi Zen Hei Mono" w:hAnsi="WenQuanYi Zen Hei Mono" w:eastAsia="WenQuanYi Zen Hei Mono" w:cs="WenQuanYi Zen Hei Mono"/>
+        </w:rPr>
+      </w:r>
+      <w:r>
+        <w:rPr>
+          <w:rFonts w:ascii="WenQuanYi Zen Hei Mono" w:hAnsi="WenQuanYi Zen Hei Mono" w:cs="WenQuanYi Zen Hei Mono"/>
         </w:rPr>
       </w:r>
     </w:p>

</xml_diff>